<commit_message>
swissbix - update stampa offerta rimossi bordi verticali
</commit_message>
<xml_diff>
--- a/customapp_swissbix/templates/template.docx
+++ b/customapp_swissbix/templates/template.docx
@@ -394,7 +394,7 @@
           <w:noProof/>
         </w:rPr>
         <w:drawing>
-          <wp:anchor distT="0" distB="0" distL="114300" distR="114300" simplePos="0" relativeHeight="251660288" behindDoc="0" locked="0" layoutInCell="1" allowOverlap="1" wp14:anchorId="23B51D15" wp14:editId="239051CE">
+          <wp:anchor distT="0" distB="0" distL="114300" distR="114300" simplePos="0" relativeHeight="251660288" behindDoc="0" locked="0" layoutInCell="1" allowOverlap="1" wp14:anchorId="23B51D15" wp14:editId="5674EE46">
             <wp:simplePos x="0" y="0"/>
             <wp:positionH relativeFrom="margin">
               <wp:align>right</wp:align>
@@ -580,6 +580,9 @@
         <w:tc>
           <w:tcPr>
             <w:tcW w:w="2333" w:type="dxa"/>
+            <w:tcBorders>
+              <w:right w:val="single" w:sz="4" w:space="0" w:color="F2F2F2" w:themeColor="background1" w:themeShade="F2"/>
+            </w:tcBorders>
             <w:shd w:val="clear" w:color="auto" w:fill="F2F2F2" w:themeFill="background1" w:themeFillShade="F2"/>
           </w:tcPr>
           <w:p>
@@ -608,6 +611,10 @@
         <w:tc>
           <w:tcPr>
             <w:tcW w:w="2336" w:type="dxa"/>
+            <w:tcBorders>
+              <w:left w:val="single" w:sz="4" w:space="0" w:color="F2F2F2" w:themeColor="background1" w:themeShade="F2"/>
+              <w:right w:val="single" w:sz="4" w:space="0" w:color="F2F2F2" w:themeColor="background1" w:themeShade="F2"/>
+            </w:tcBorders>
             <w:shd w:val="clear" w:color="auto" w:fill="F2F2F2" w:themeFill="background1" w:themeFillShade="F2"/>
           </w:tcPr>
           <w:p>
@@ -635,6 +642,10 @@
         <w:tc>
           <w:tcPr>
             <w:tcW w:w="2338" w:type="dxa"/>
+            <w:tcBorders>
+              <w:left w:val="single" w:sz="4" w:space="0" w:color="F2F2F2" w:themeColor="background1" w:themeShade="F2"/>
+              <w:right w:val="single" w:sz="4" w:space="0" w:color="F2F2F2" w:themeColor="background1" w:themeShade="F2"/>
+            </w:tcBorders>
             <w:shd w:val="clear" w:color="auto" w:fill="F2F2F2" w:themeFill="background1" w:themeFillShade="F2"/>
           </w:tcPr>
           <w:p>
@@ -663,6 +674,9 @@
         <w:tc>
           <w:tcPr>
             <w:tcW w:w="2333" w:type="dxa"/>
+            <w:tcBorders>
+              <w:left w:val="single" w:sz="4" w:space="0" w:color="F2F2F2" w:themeColor="background1" w:themeShade="F2"/>
+            </w:tcBorders>
             <w:shd w:val="clear" w:color="auto" w:fill="F2F2F2" w:themeFill="background1" w:themeFillShade="F2"/>
           </w:tcPr>
           <w:p>
@@ -738,6 +752,7 @@
             <w:tcW w:w="2333" w:type="dxa"/>
             <w:tcBorders>
               <w:top w:val="single" w:sz="4" w:space="0" w:color="FFFFFF" w:themeColor="background1"/>
+              <w:right w:val="single" w:sz="4" w:space="0" w:color="FFFFFF" w:themeColor="background1"/>
             </w:tcBorders>
           </w:tcPr>
           <w:p>
@@ -782,6 +797,8 @@
             <w:tcW w:w="2336" w:type="dxa"/>
             <w:tcBorders>
               <w:top w:val="single" w:sz="4" w:space="0" w:color="FFFFFF" w:themeColor="background1"/>
+              <w:left w:val="single" w:sz="4" w:space="0" w:color="FFFFFF" w:themeColor="background1"/>
+              <w:right w:val="single" w:sz="4" w:space="0" w:color="FFFFFF" w:themeColor="background1"/>
             </w:tcBorders>
           </w:tcPr>
           <w:p>
@@ -819,6 +836,8 @@
             <w:tcW w:w="2338" w:type="dxa"/>
             <w:tcBorders>
               <w:top w:val="single" w:sz="4" w:space="0" w:color="FFFFFF" w:themeColor="background1"/>
+              <w:left w:val="single" w:sz="4" w:space="0" w:color="FFFFFF" w:themeColor="background1"/>
+              <w:right w:val="single" w:sz="4" w:space="0" w:color="FFFFFF" w:themeColor="background1"/>
             </w:tcBorders>
           </w:tcPr>
           <w:p>
@@ -872,6 +891,7 @@
             <w:tcW w:w="2333" w:type="dxa"/>
             <w:tcBorders>
               <w:top w:val="single" w:sz="4" w:space="0" w:color="FFFFFF" w:themeColor="background1"/>
+              <w:left w:val="single" w:sz="4" w:space="0" w:color="FFFFFF" w:themeColor="background1"/>
             </w:tcBorders>
           </w:tcPr>
           <w:p>
@@ -979,6 +999,9 @@
           <w:tcPr>
             <w:tcW w:w="7007" w:type="dxa"/>
             <w:gridSpan w:val="3"/>
+            <w:tcBorders>
+              <w:right w:val="single" w:sz="4" w:space="0" w:color="F2F2F2" w:themeColor="background1" w:themeShade="F2"/>
+            </w:tcBorders>
             <w:shd w:val="clear" w:color="auto" w:fill="F2F2F2" w:themeFill="background1" w:themeFillShade="F2"/>
           </w:tcPr>
           <w:p>
@@ -1011,6 +1034,9 @@
           <w:tcPr>
             <w:tcW w:w="2341" w:type="dxa"/>
             <w:gridSpan w:val="2"/>
+            <w:tcBorders>
+              <w:left w:val="single" w:sz="4" w:space="0" w:color="F2F2F2" w:themeColor="background1" w:themeShade="F2"/>
+            </w:tcBorders>
             <w:shd w:val="clear" w:color="auto" w:fill="F2F2F2" w:themeFill="background1" w:themeFillShade="F2"/>
           </w:tcPr>
           <w:p>
@@ -4381,6 +4407,7 @@
   <w:style w:type="character" w:default="1" w:styleId="Carpredefinitoparagrafo">
     <w:name w:val="Default Paragraph Font"/>
     <w:uiPriority w:val="1"/>
+    <w:semiHidden/>
     <w:unhideWhenUsed/>
   </w:style>
   <w:style w:type="table" w:default="1" w:styleId="Tabellanormale">

</xml_diff>